<commit_message>
Updating LE sector plot colors and 2019 -> 2018 in plots to be more clear.
</commit_message>
<xml_diff>
--- a/docs/chapters/ewg31_le_docx.docx
+++ b/docs/chapters/ewg31_le_docx.docx
@@ -341,13 +341,13 @@
           <w:bCs/>
           <w:b/>
         </w:rPr>
-        <w:t xml:space="preserve">Option B (2019 census):</w:t>
-      </w:r>
-      <w:r>
-        <w:t xml:space="preserve"> </w:t>
-      </w:r>
-      <w:r>
-        <w:t xml:space="preserve">each region’s 2019 Economic Census value (2018 in the adjusted census-year series)</w:t>
+        <w:t xml:space="preserve">Option B (2018 value):</w:t>
+      </w:r>
+      <w:r>
+        <w:t xml:space="preserve"> </w:t>
+      </w:r>
+      <w:r>
+        <w:t xml:space="preserve">each region’s 2018 value</w:t>
       </w:r>
     </w:p>
     <w:p>
@@ -384,7 +384,7 @@
         <w:t xml:space="preserve"> </w:t>
       </w:r>
       <w:r>
-        <w:t xml:space="preserve">tracks marine related revenue (M000A from Censos Económicos), compared to either Option A (2003–2013 historical average revenue) or Option B (2019 Economic Census revenue).</w:t>
+        <w:t xml:space="preserve">tracks marine related revenue (M000A from Censos Económicos), compared to either Option A (2003–2013 historical average revenue) or Option B (2018 revenue).</w:t>
       </w:r>
     </w:p>
     <w:p>
@@ -1161,7 +1161,7 @@
     </w:p>
     <w:bookmarkEnd w:id="25"/>
     <w:bookmarkEnd w:id="26"/>
-    <w:bookmarkStart w:id="48" w:name="overall-livelihoods-and-economies-status"/>
+    <w:bookmarkStart w:id="42" w:name="overall-livelihoods-and-economies-status"/>
     <w:p>
       <w:pPr>
         <w:pStyle w:val="Heading2"/>
@@ -1213,7 +1213,7 @@
         <w:t xml:space="preserve">ECO revenue</w:t>
       </w:r>
       <w:r>
-        <w:t xml:space="preserve">, the charts below show two reference options in separate figures (historical reference above, 2019 reference below).</w:t>
+        <w:t xml:space="preserve">, the charts below show two reference options in separate figures (historical reference above, 2018 reference below).</w:t>
       </w:r>
       <w:r>
         <w:t xml:space="preserve"> </w:t>
@@ -1229,7 +1229,23 @@
         <w:t xml:space="preserve"> </w:t>
       </w:r>
       <w:r>
-        <w:t xml:space="preserve">uses the same Gulf-wide 90th-quantile reference in both scenarios.</w:t>
+        <w:t xml:space="preserve">uses the same Gulf-wide 90th-quantile reference in both scenarios. The Option B</w:t>
+      </w:r>
+      <w:r>
+        <w:t xml:space="preserve"> </w:t>
+      </w:r>
+      <w:r>
+        <w:rPr>
+          <w:bCs/>
+          <w:b/>
+        </w:rPr>
+        <w:t xml:space="preserve">2018 value</w:t>
+      </w:r>
+      <w:r>
+        <w:t xml:space="preserve"> </w:t>
+      </w:r>
+      <w:r>
+        <w:t xml:space="preserve">is the 2018 data collection year from the 2019 Economic Census release.</w:t>
       </w:r>
     </w:p>
     <w:tbl>
@@ -1241,9 +1257,9 @@
         <w:tblLayout w:type="fixed"/>
       </w:tblPr>
       <w:tblGrid>
-        <w:gridCol w:w="1049"/>
-        <w:gridCol w:w="3816"/>
-        <w:gridCol w:w="3053"/>
+        <w:gridCol w:w="1193"/>
+        <w:gridCol w:w="4339"/>
+        <w:gridCol w:w="2386"/>
       </w:tblGrid>
       <w:tr>
         <w:trPr>
@@ -1281,7 +1297,7 @@
               <w:jc w:val="left"/>
             </w:pPr>
             <w:r>
-              <w:t xml:space="preserve">Option B: 2019 Economic Census</w:t>
+              <w:t xml:space="preserve">Option B: 2018 value</w:t>
             </w:r>
           </w:p>
         </w:tc>
@@ -1319,7 +1335,7 @@
               <w:jc w:val="left"/>
             </w:pPr>
             <w:r>
-              <w:t xml:space="preserve">Jobs per coastal resident in the 2019 census wave (2018 in adjusted series)</w:t>
+              <w:t xml:space="preserve">Jobs per coastal resident in 2018</w:t>
             </w:r>
           </w:p>
         </w:tc>
@@ -1357,7 +1373,7 @@
               <w:jc w:val="left"/>
             </w:pPr>
             <w:r>
-              <w:t xml:space="preserve">Total marine revenue in the 2019 census wave (2018 in adjusted series)</w:t>
+              <w:t xml:space="preserve">Total marine revenue in 2018</w:t>
             </w:r>
           </w:p>
         </w:tc>
@@ -1773,7 +1789,7 @@
         <w:t xml:space="preserve"> </w:t>
       </w:r>
       <w:r>
-        <w:t xml:space="preserve">for each metric (historical reference above, 2019 reference below). Because data are available only at census intervals, lines connect five points; steep changes between points reflect multi-year shifts rather than year-to-year volatility.</w:t>
+        <w:t xml:space="preserve">for each metric (historical reference above, 2018 reference below). Because data are available only at census intervals, lines connect five points; steep changes between points reflect multi-year shifts rather than year-to-year volatility.</w:t>
       </w:r>
     </w:p>
     <w:bookmarkEnd w:id="27"/>
@@ -2126,13 +2142,13 @@
       </w:r>
     </w:p>
     <w:bookmarkEnd w:id="34"/>
-    <w:bookmarkStart w:id="47" w:name="Xf863cb451b69f9b70572e89e80e6daf5c553083"/>
+    <w:bookmarkStart w:id="41" w:name="gulf-wide-trajectories-for-overall-le"/>
     <w:p>
       <w:pPr>
         <w:pStyle w:val="Heading3"/>
       </w:pPr>
       <w:r>
-        <w:t xml:space="preserve">1.5.3 Regional and Gulf-wide trajectories for overall LE</w:t>
+        <w:t xml:space="preserve">1.5.3 Gulf-wide trajectories for overall LE</w:t>
       </w:r>
     </w:p>
     <w:p>
@@ -2150,7 +2166,7 @@
         <w:t xml:space="preserve"> </w:t>
       </w:r>
       <w:r>
-        <w:t xml:space="preserve">The same overall LE score shown at regional scale (charts above) and as a Gulf of California-wide average across all regions (charts below).</w:t>
+        <w:t xml:space="preserve">The overall LE score averaged across all OHI GoC regions at each census year.</w:t>
       </w:r>
     </w:p>
     <w:p>
@@ -2168,7 +2184,7 @@
         <w:t xml:space="preserve"> </w:t>
       </w:r>
       <w:r>
-        <w:t xml:space="preserve">INEGI Censos Economicos merged outputs; Gulf average computed as the mean of regional LE scores at each census year, excluding Region 2.</w:t>
+        <w:t xml:space="preserve">INEGI Censos Economicos merged outputs; Gulf average computed as the mean of regional LE scores at each census year, excluding Region 2 due to data quality issues.</w:t>
       </w:r>
     </w:p>
     <w:p>
@@ -2186,7 +2202,7 @@
         <w:t xml:space="preserve"> </w:t>
       </w:r>
       <w:r>
-        <w:t xml:space="preserve">Regional scores follow the LE formula above. The Gulf-wide line averages the eight regions with reported LE scores (Region 2 excluded):</w:t>
+        <w:t xml:space="preserve">The Gulf-wide line averages the eight regions with reported LE scores (Region 2 excluded):</w:t>
       </w:r>
     </w:p>
     <w:p>
@@ -2310,7 +2326,7 @@
         <w:pStyle w:val="FirstParagraph"/>
       </w:pPr>
       <w:r>
-        <w:t xml:space="preserve">The regional charts compare OHI regions with reported scores. The Gulf-wide charts summarize the average trajectory across regions with sufficient data. For each view, the historical reference chart appears above the 2019 reference chart.</w:t>
+        <w:t xml:space="preserve">The Gulf-wide charts summarize the average trajectory across regions with sufficient data. The historical reference chart appears above the 2018 reference chart.</w:t>
       </w:r>
     </w:p>
     <w:p>
@@ -2407,103 +2423,9 @@
         </w:drawing>
       </w:r>
     </w:p>
-    <w:p>
-      <w:pPr>
-        <w:pStyle w:val="BodyText"/>
-      </w:pPr>
-      <w:r>
-        <w:drawing>
-          <wp:inline>
-            <wp:extent cx="5334000" cy="3429000"/>
-            <wp:effectExtent b="0" l="0" r="0" t="0"/>
-            <wp:docPr descr="" title="" id="42" name="Picture"/>
-            <a:graphic>
-              <a:graphicData uri="http://schemas.openxmlformats.org/drawingml/2006/picture">
-                <pic:pic>
-                  <pic:nvPicPr>
-                    <pic:cNvPr descr="ewg31_le_docx_files/figure-docx/unnamed-chunk-5-3.png" id="43" name="Picture"/>
-                    <pic:cNvPicPr>
-                      <a:picLocks noChangeArrowheads="1" noChangeAspect="1"/>
-                    </pic:cNvPicPr>
-                  </pic:nvPicPr>
-                  <pic:blipFill>
-                    <a:blip r:embed="rId41"/>
-                    <a:stretch>
-                      <a:fillRect/>
-                    </a:stretch>
-                  </pic:blipFill>
-                  <pic:spPr bwMode="auto">
-                    <a:xfrm>
-                      <a:off x="0" y="0"/>
-                      <a:ext cx="5334000" cy="3429000"/>
-                    </a:xfrm>
-                    <a:prstGeom prst="rect">
-                      <a:avLst/>
-                    </a:prstGeom>
-                    <a:noFill/>
-                    <a:ln w="9525">
-                      <a:noFill/>
-                      <a:headEnd/>
-                      <a:tailEnd/>
-                    </a:ln>
-                  </pic:spPr>
-                </pic:pic>
-              </a:graphicData>
-            </a:graphic>
-          </wp:inline>
-        </w:drawing>
-      </w:r>
-    </w:p>
-    <w:p>
-      <w:pPr>
-        <w:pStyle w:val="BodyText"/>
-      </w:pPr>
-      <w:r>
-        <w:drawing>
-          <wp:inline>
-            <wp:extent cx="5334000" cy="3429000"/>
-            <wp:effectExtent b="0" l="0" r="0" t="0"/>
-            <wp:docPr descr="" title="" id="45" name="Picture"/>
-            <a:graphic>
-              <a:graphicData uri="http://schemas.openxmlformats.org/drawingml/2006/picture">
-                <pic:pic>
-                  <pic:nvPicPr>
-                    <pic:cNvPr descr="ewg31_le_docx_files/figure-docx/unnamed-chunk-5-4.png" id="46" name="Picture"/>
-                    <pic:cNvPicPr>
-                      <a:picLocks noChangeArrowheads="1" noChangeAspect="1"/>
-                    </pic:cNvPicPr>
-                  </pic:nvPicPr>
-                  <pic:blipFill>
-                    <a:blip r:embed="rId44"/>
-                    <a:stretch>
-                      <a:fillRect/>
-                    </a:stretch>
-                  </pic:blipFill>
-                  <pic:spPr bwMode="auto">
-                    <a:xfrm>
-                      <a:off x="0" y="0"/>
-                      <a:ext cx="5334000" cy="3429000"/>
-                    </a:xfrm>
-                    <a:prstGeom prst="rect">
-                      <a:avLst/>
-                    </a:prstGeom>
-                    <a:noFill/>
-                    <a:ln w="9525">
-                      <a:noFill/>
-                      <a:headEnd/>
-                      <a:tailEnd/>
-                    </a:ln>
-                  </pic:spPr>
-                </pic:pic>
-              </a:graphicData>
-            </a:graphic>
-          </wp:inline>
-        </w:drawing>
-      </w:r>
-    </w:p>
-    <w:bookmarkEnd w:id="47"/>
-    <w:bookmarkEnd w:id="48"/>
-    <w:bookmarkStart w:id="73" w:name="liv-subgoal"/>
+    <w:bookmarkEnd w:id="41"/>
+    <w:bookmarkEnd w:id="42"/>
+    <w:bookmarkStart w:id="67" w:name="liv-subgoal"/>
     <w:p>
       <w:pPr>
         <w:pStyle w:val="Heading2"/>
@@ -2603,7 +2525,7 @@
         <w:t xml:space="preserve"> </w:t>
       </w:r>
       <w:r>
-        <w:t xml:space="preserve">Jobs are summed across marine sectors, adjusted for coastal share, divided by interpolated coastal population, and compared to either the 2003–2013 per-capita average (Option A) or the 2019 Economic Census value (Option B). Job quality sums J300A and J400A per job (constant 2023 MXN) and compares to the Gulf-wide 90th quantile across all regions and census years (unchanged across scenarios).</w:t>
+        <w:t xml:space="preserve">Jobs are summed across marine sectors, adjusted for coastal share, divided by interpolated coastal population, and compared to either the 2003–2013 per-capita average (Option A) or the 2018 value (Option B). Job quality sums J300A and J400A per job (constant 2023 MXN) and compares to the Gulf-wide 90th quantile across all regions and census years (unchanged across scenarios).</w:t>
       </w:r>
     </w:p>
     <w:p>
@@ -2801,7 +2723,7 @@
         </m:oMath>
       </m:oMathPara>
     </w:p>
-    <w:bookmarkStart w:id="72" w:name="liv-merged-result"/>
+    <w:bookmarkStart w:id="66" w:name="liv-merged-result"/>
     <w:p>
       <w:pPr>
         <w:pStyle w:val="Heading3"/>
@@ -3056,18 +2978,18 @@
           <wp:inline>
             <wp:extent cx="5334000" cy="3429000"/>
             <wp:effectExtent b="0" l="0" r="0" t="0"/>
-            <wp:docPr descr="" title="" id="50" name="Picture"/>
+            <wp:docPr descr="" title="" id="44" name="Picture"/>
             <a:graphic>
               <a:graphicData uri="http://schemas.openxmlformats.org/drawingml/2006/picture">
                 <pic:pic>
                   <pic:nvPicPr>
-                    <pic:cNvPr descr="ewg31_le_docx_files/figure-docx/unnamed-chunk-6-1.png" id="51" name="Picture"/>
+                    <pic:cNvPr descr="ewg31_le_docx_files/figure-docx/unnamed-chunk-6-1.png" id="45" name="Picture"/>
                     <pic:cNvPicPr>
                       <a:picLocks noChangeArrowheads="1" noChangeAspect="1"/>
                     </pic:cNvPicPr>
                   </pic:nvPicPr>
                   <pic:blipFill>
-                    <a:blip r:embed="rId49"/>
+                    <a:blip r:embed="rId43"/>
                     <a:stretch>
                       <a:fillRect/>
                     </a:stretch>
@@ -3103,18 +3025,18 @@
           <wp:inline>
             <wp:extent cx="5334000" cy="3429000"/>
             <wp:effectExtent b="0" l="0" r="0" t="0"/>
-            <wp:docPr descr="" title="" id="53" name="Picture"/>
+            <wp:docPr descr="" title="" id="47" name="Picture"/>
             <a:graphic>
               <a:graphicData uri="http://schemas.openxmlformats.org/drawingml/2006/picture">
                 <pic:pic>
                   <pic:nvPicPr>
-                    <pic:cNvPr descr="ewg31_le_docx_files/figure-docx/unnamed-chunk-6-2.png" id="54" name="Picture"/>
+                    <pic:cNvPr descr="ewg31_le_docx_files/figure-docx/unnamed-chunk-6-2.png" id="48" name="Picture"/>
                     <pic:cNvPicPr>
                       <a:picLocks noChangeArrowheads="1" noChangeAspect="1"/>
                     </pic:cNvPicPr>
                   </pic:nvPicPr>
                   <pic:blipFill>
-                    <a:blip r:embed="rId52"/>
+                    <a:blip r:embed="rId46"/>
                     <a:stretch>
                       <a:fillRect/>
                     </a:stretch>
@@ -3141,7 +3063,7 @@
         </w:drawing>
       </w:r>
     </w:p>
-    <w:bookmarkStart w:id="56" w:name="liv-subcomponents"/>
+    <w:bookmarkStart w:id="50" w:name="liv-subcomponents"/>
     <w:p>
       <w:pPr>
         <w:pStyle w:val="Heading4"/>
@@ -3150,7 +3072,7 @@
         <w:t xml:space="preserve">1.6.1.1 LIV subcomponents</w:t>
       </w:r>
     </w:p>
-    <w:bookmarkStart w:id="55" w:name="number-of-jobs"/>
+    <w:bookmarkStart w:id="49" w:name="number-of-jobs"/>
     <w:p>
       <w:pPr>
         <w:pStyle w:val="Heading5"/>
@@ -3518,7 +3440,7 @@
           <w:bCs/>
           <w:b/>
         </w:rPr>
-        <w:t xml:space="preserve">Method (Option B, 2019 census):</w:t>
+        <w:t xml:space="preserve">Method (Option B, 2018 value):</w:t>
       </w:r>
       <w:r>
         <w:t xml:space="preserve"> </w:t>
@@ -3538,7 +3460,7 @@
         <w:t xml:space="preserve"> </w:t>
       </w:r>
       <w:r>
-        <w:t xml:space="preserve">divided by the 2019 Economic Census value for that region (census year 2018 in the adjusted series), capped at 100.</w:t>
+        <w:t xml:space="preserve">divided by the 2018 value for that region, capped at 100.</w:t>
       </w:r>
     </w:p>
     <w:p>
@@ -3757,7 +3679,7 @@
                         <m:t>,</m:t>
                       </m:r>
                       <m:r>
-                        <m:t>2019</m:t>
+                        <m:t>2018</m:t>
                       </m:r>
                     </m:sub>
                   </m:sSub>
@@ -3777,9 +3699,9 @@
         </m:oMath>
       </m:oMathPara>
     </w:p>
-    <w:bookmarkEnd w:id="55"/>
-    <w:bookmarkEnd w:id="56"/>
-    <w:bookmarkStart w:id="61" w:name="raw-marine-related-jobs-by-region"/>
+    <w:bookmarkEnd w:id="49"/>
+    <w:bookmarkEnd w:id="50"/>
+    <w:bookmarkStart w:id="55" w:name="raw-marine-related-jobs-by-region"/>
     <w:p>
       <w:pPr>
         <w:pStyle w:val="Heading4"/>
@@ -3805,18 +3727,18 @@
           <wp:inline>
             <wp:extent cx="5334000" cy="3429000"/>
             <wp:effectExtent b="0" l="0" r="0" t="0"/>
-            <wp:docPr descr="" title="" id="58" name="Picture"/>
+            <wp:docPr descr="" title="" id="52" name="Picture"/>
             <a:graphic>
               <a:graphicData uri="http://schemas.openxmlformats.org/drawingml/2006/picture">
                 <pic:pic>
                   <pic:nvPicPr>
-                    <pic:cNvPr descr="ewg31_le_docx_files/figure-docx/unnamed-chunk-7-1.png" id="59" name="Picture"/>
+                    <pic:cNvPr descr="ewg31_le_docx_files/figure-docx/unnamed-chunk-7-1.png" id="53" name="Picture"/>
                     <pic:cNvPicPr>
                       <a:picLocks noChangeArrowheads="1" noChangeAspect="1"/>
                     </pic:cNvPicPr>
                   </pic:nvPicPr>
                   <pic:blipFill>
-                    <a:blip r:embed="rId57"/>
+                    <a:blip r:embed="rId51"/>
                     <a:stretch>
                       <a:fillRect/>
                     </a:stretch>
@@ -3843,7 +3765,7 @@
         </w:drawing>
       </w:r>
     </w:p>
-    <w:bookmarkStart w:id="60" w:name="quality-of-jobs"/>
+    <w:bookmarkStart w:id="54" w:name="quality-of-jobs"/>
     <w:p>
       <w:pPr>
         <w:pStyle w:val="Heading5"/>
@@ -3852,9 +3774,9 @@
         <w:t xml:space="preserve">1.6.1.2.1 Quality of jobs</w:t>
       </w:r>
     </w:p>
-    <w:bookmarkEnd w:id="60"/>
-    <w:bookmarkEnd w:id="61"/>
-    <w:bookmarkStart w:id="71" w:name="understanding-j300a-and-j400a"/>
+    <w:bookmarkEnd w:id="54"/>
+    <w:bookmarkEnd w:id="55"/>
+    <w:bookmarkStart w:id="65" w:name="understanding-j300a-and-j400a"/>
     <w:p>
       <w:pPr>
         <w:pStyle w:val="Heading4"/>
@@ -4659,12 +4581,106 @@
           <wp:inline>
             <wp:extent cx="5334000" cy="3429000"/>
             <wp:effectExtent b="0" l="0" r="0" t="0"/>
+            <wp:docPr descr="" title="" id="57" name="Picture"/>
+            <a:graphic>
+              <a:graphicData uri="http://schemas.openxmlformats.org/drawingml/2006/picture">
+                <pic:pic>
+                  <pic:nvPicPr>
+                    <pic:cNvPr descr="ewg31_le_docx_files/figure-docx/unnamed-chunk-8-1.png" id="58" name="Picture"/>
+                    <pic:cNvPicPr>
+                      <a:picLocks noChangeArrowheads="1" noChangeAspect="1"/>
+                    </pic:cNvPicPr>
+                  </pic:nvPicPr>
+                  <pic:blipFill>
+                    <a:blip r:embed="rId56"/>
+                    <a:stretch>
+                      <a:fillRect/>
+                    </a:stretch>
+                  </pic:blipFill>
+                  <pic:spPr bwMode="auto">
+                    <a:xfrm>
+                      <a:off x="0" y="0"/>
+                      <a:ext cx="5334000" cy="3429000"/>
+                    </a:xfrm>
+                    <a:prstGeom prst="rect">
+                      <a:avLst/>
+                    </a:prstGeom>
+                    <a:noFill/>
+                    <a:ln w="9525">
+                      <a:noFill/>
+                      <a:headEnd/>
+                      <a:tailEnd/>
+                    </a:ln>
+                  </pic:spPr>
+                </pic:pic>
+              </a:graphicData>
+            </a:graphic>
+          </wp:inline>
+        </w:drawing>
+      </w:r>
+    </w:p>
+    <w:p>
+      <w:pPr>
+        <w:pStyle w:val="BodyText"/>
+      </w:pPr>
+      <w:r>
+        <w:drawing>
+          <wp:inline>
+            <wp:extent cx="5334000" cy="3429000"/>
+            <wp:effectExtent b="0" l="0" r="0" t="0"/>
+            <wp:docPr descr="" title="" id="60" name="Picture"/>
+            <a:graphic>
+              <a:graphicData uri="http://schemas.openxmlformats.org/drawingml/2006/picture">
+                <pic:pic>
+                  <pic:nvPicPr>
+                    <pic:cNvPr descr="ewg31_le_docx_files/figure-docx/unnamed-chunk-8-2.png" id="61" name="Picture"/>
+                    <pic:cNvPicPr>
+                      <a:picLocks noChangeArrowheads="1" noChangeAspect="1"/>
+                    </pic:cNvPicPr>
+                  </pic:nvPicPr>
+                  <pic:blipFill>
+                    <a:blip r:embed="rId59"/>
+                    <a:stretch>
+                      <a:fillRect/>
+                    </a:stretch>
+                  </pic:blipFill>
+                  <pic:spPr bwMode="auto">
+                    <a:xfrm>
+                      <a:off x="0" y="0"/>
+                      <a:ext cx="5334000" cy="3429000"/>
+                    </a:xfrm>
+                    <a:prstGeom prst="rect">
+                      <a:avLst/>
+                    </a:prstGeom>
+                    <a:noFill/>
+                    <a:ln w="9525">
+                      <a:noFill/>
+                      <a:headEnd/>
+                      <a:tailEnd/>
+                    </a:ln>
+                  </pic:spPr>
+                </pic:pic>
+              </a:graphicData>
+            </a:graphic>
+          </wp:inline>
+        </w:drawing>
+      </w:r>
+    </w:p>
+    <w:p>
+      <w:pPr>
+        <w:pStyle w:val="BodyText"/>
+      </w:pPr>
+      <w:r>
+        <w:drawing>
+          <wp:inline>
+            <wp:extent cx="5334000" cy="3429000"/>
+            <wp:effectExtent b="0" l="0" r="0" t="0"/>
             <wp:docPr descr="" title="" id="63" name="Picture"/>
             <a:graphic>
               <a:graphicData uri="http://schemas.openxmlformats.org/drawingml/2006/picture">
                 <pic:pic>
                   <pic:nvPicPr>
-                    <pic:cNvPr descr="ewg31_le_docx_files/figure-docx/unnamed-chunk-8-1.png" id="64" name="Picture"/>
+                    <pic:cNvPr descr="ewg31_le_docx_files/figure-docx/unnamed-chunk-8-3.png" id="64" name="Picture"/>
                     <pic:cNvPicPr>
                       <a:picLocks noChangeArrowheads="1" noChangeAspect="1"/>
                     </pic:cNvPicPr>
@@ -4697,104 +4713,10 @@
         </w:drawing>
       </w:r>
     </w:p>
-    <w:p>
-      <w:pPr>
-        <w:pStyle w:val="BodyText"/>
-      </w:pPr>
-      <w:r>
-        <w:drawing>
-          <wp:inline>
-            <wp:extent cx="5334000" cy="3429000"/>
-            <wp:effectExtent b="0" l="0" r="0" t="0"/>
-            <wp:docPr descr="" title="" id="66" name="Picture"/>
-            <a:graphic>
-              <a:graphicData uri="http://schemas.openxmlformats.org/drawingml/2006/picture">
-                <pic:pic>
-                  <pic:nvPicPr>
-                    <pic:cNvPr descr="ewg31_le_docx_files/figure-docx/unnamed-chunk-8-2.png" id="67" name="Picture"/>
-                    <pic:cNvPicPr>
-                      <a:picLocks noChangeArrowheads="1" noChangeAspect="1"/>
-                    </pic:cNvPicPr>
-                  </pic:nvPicPr>
-                  <pic:blipFill>
-                    <a:blip r:embed="rId65"/>
-                    <a:stretch>
-                      <a:fillRect/>
-                    </a:stretch>
-                  </pic:blipFill>
-                  <pic:spPr bwMode="auto">
-                    <a:xfrm>
-                      <a:off x="0" y="0"/>
-                      <a:ext cx="5334000" cy="3429000"/>
-                    </a:xfrm>
-                    <a:prstGeom prst="rect">
-                      <a:avLst/>
-                    </a:prstGeom>
-                    <a:noFill/>
-                    <a:ln w="9525">
-                      <a:noFill/>
-                      <a:headEnd/>
-                      <a:tailEnd/>
-                    </a:ln>
-                  </pic:spPr>
-                </pic:pic>
-              </a:graphicData>
-            </a:graphic>
-          </wp:inline>
-        </w:drawing>
-      </w:r>
-    </w:p>
-    <w:p>
-      <w:pPr>
-        <w:pStyle w:val="BodyText"/>
-      </w:pPr>
-      <w:r>
-        <w:drawing>
-          <wp:inline>
-            <wp:extent cx="5334000" cy="3429000"/>
-            <wp:effectExtent b="0" l="0" r="0" t="0"/>
-            <wp:docPr descr="" title="" id="69" name="Picture"/>
-            <a:graphic>
-              <a:graphicData uri="http://schemas.openxmlformats.org/drawingml/2006/picture">
-                <pic:pic>
-                  <pic:nvPicPr>
-                    <pic:cNvPr descr="ewg31_le_docx_files/figure-docx/unnamed-chunk-8-3.png" id="70" name="Picture"/>
-                    <pic:cNvPicPr>
-                      <a:picLocks noChangeArrowheads="1" noChangeAspect="1"/>
-                    </pic:cNvPicPr>
-                  </pic:nvPicPr>
-                  <pic:blipFill>
-                    <a:blip r:embed="rId68"/>
-                    <a:stretch>
-                      <a:fillRect/>
-                    </a:stretch>
-                  </pic:blipFill>
-                  <pic:spPr bwMode="auto">
-                    <a:xfrm>
-                      <a:off x="0" y="0"/>
-                      <a:ext cx="5334000" cy="3429000"/>
-                    </a:xfrm>
-                    <a:prstGeom prst="rect">
-                      <a:avLst/>
-                    </a:prstGeom>
-                    <a:noFill/>
-                    <a:ln w="9525">
-                      <a:noFill/>
-                      <a:headEnd/>
-                      <a:tailEnd/>
-                    </a:ln>
-                  </pic:spPr>
-                </pic:pic>
-              </a:graphicData>
-            </a:graphic>
-          </wp:inline>
-        </w:drawing>
-      </w:r>
-    </w:p>
-    <w:bookmarkEnd w:id="71"/>
-    <w:bookmarkEnd w:id="72"/>
-    <w:bookmarkEnd w:id="73"/>
-    <w:bookmarkStart w:id="85" w:name="eco-subgoal"/>
+    <w:bookmarkEnd w:id="65"/>
+    <w:bookmarkEnd w:id="66"/>
+    <w:bookmarkEnd w:id="67"/>
+    <w:bookmarkStart w:id="79" w:name="eco-subgoal"/>
     <w:p>
       <w:pPr>
         <w:pStyle w:val="Heading2"/>
@@ -5060,13 +4982,13 @@
           <w:bCs/>
           <w:b/>
         </w:rPr>
-        <w:t xml:space="preserve">Method (Option B, 2019 census):</w:t>
-      </w:r>
-      <w:r>
-        <w:t xml:space="preserve"> </w:t>
-      </w:r>
-      <w:r>
-        <w:t xml:space="preserve">Current revenue divided by the 2019 Economic Census revenue for that region (census year 2018), capped at 100.</w:t>
+        <w:t xml:space="preserve">Method (Option B, 2018 value):</w:t>
+      </w:r>
+      <w:r>
+        <w:t xml:space="preserve"> </w:t>
+      </w:r>
+      <w:r>
+        <w:t xml:space="preserve">Current revenue divided by the 2018 revenue for that region, capped at 100.</w:t>
       </w:r>
     </w:p>
     <w:p>
@@ -5197,7 +5119,7 @@
                         <m:t>,</m:t>
                       </m:r>
                       <m:r>
-                        <m:t>2019</m:t>
+                        <m:t>2018</m:t>
                       </m:r>
                     </m:sub>
                   </m:sSub>
@@ -5217,7 +5139,7 @@
         </m:oMath>
       </m:oMathPara>
     </w:p>
-    <w:bookmarkStart w:id="84" w:name="eco-result"/>
+    <w:bookmarkStart w:id="78" w:name="eco-result"/>
     <w:p>
       <w:pPr>
         <w:pStyle w:val="Heading3"/>
@@ -5241,7 +5163,7 @@
         <w:t xml:space="preserve"> </w:t>
       </w:r>
       <w:r>
-        <w:t xml:space="preserve">Marine-related operating revenue relative to the regional reference (historical average or 2019 census, depending on figure).</w:t>
+        <w:t xml:space="preserve">Marine-related operating revenue relative to the regional reference (historical average or 2018 value, depending on figure).</w:t>
       </w:r>
     </w:p>
     <w:p>
@@ -5294,7 +5216,7 @@
         <w:t xml:space="preserve">divided by the reference value for that region. Scores at or above the reference receive 100; lower values reflect proportional reductions. The chart shows both reference options.</w:t>
       </w:r>
     </w:p>
-    <w:bookmarkStart w:id="83" w:name="raw-marine-related-revenue-by-region"/>
+    <w:bookmarkStart w:id="77" w:name="raw-marine-related-revenue-by-region"/>
     <w:p>
       <w:pPr>
         <w:pStyle w:val="Heading4"/>
@@ -5309,6 +5231,100 @@
       </w:pPr>
       <w:r>
         <w:t xml:space="preserve">This chart shows total operating revenue in constant 2023 MXN before current status scoring. Use it to compare absolute economic scale across regions and census years. Revenue reflects M000A summed across marine-related sectors (fishing, mariculture, seafood processing/trade, port/dock construction, boat building, tidal energy, oil/gas maritime transport, cargo maritime transport, marine tourist transport, coastal recreation, travel planners, accommodations/food/drink, environmental research/consulting) after coastal adjustments. Region 2 values should not be interpreted because municipal census data cannot reliably separate Gulf-side revenue.</w:t>
+      </w:r>
+    </w:p>
+    <w:p>
+      <w:pPr>
+        <w:pStyle w:val="BodyText"/>
+      </w:pPr>
+      <w:r>
+        <w:drawing>
+          <wp:inline>
+            <wp:extent cx="5334000" cy="3429000"/>
+            <wp:effectExtent b="0" l="0" r="0" t="0"/>
+            <wp:docPr descr="" title="" id="69" name="Picture"/>
+            <a:graphic>
+              <a:graphicData uri="http://schemas.openxmlformats.org/drawingml/2006/picture">
+                <pic:pic>
+                  <pic:nvPicPr>
+                    <pic:cNvPr descr="ewg31_le_docx_files/figure-docx/unnamed-chunk-9-1.png" id="70" name="Picture"/>
+                    <pic:cNvPicPr>
+                      <a:picLocks noChangeArrowheads="1" noChangeAspect="1"/>
+                    </pic:cNvPicPr>
+                  </pic:nvPicPr>
+                  <pic:blipFill>
+                    <a:blip r:embed="rId68"/>
+                    <a:stretch>
+                      <a:fillRect/>
+                    </a:stretch>
+                  </pic:blipFill>
+                  <pic:spPr bwMode="auto">
+                    <a:xfrm>
+                      <a:off x="0" y="0"/>
+                      <a:ext cx="5334000" cy="3429000"/>
+                    </a:xfrm>
+                    <a:prstGeom prst="rect">
+                      <a:avLst/>
+                    </a:prstGeom>
+                    <a:noFill/>
+                    <a:ln w="9525">
+                      <a:noFill/>
+                      <a:headEnd/>
+                      <a:tailEnd/>
+                    </a:ln>
+                  </pic:spPr>
+                </pic:pic>
+              </a:graphicData>
+            </a:graphic>
+          </wp:inline>
+        </w:drawing>
+      </w:r>
+    </w:p>
+    <w:p>
+      <w:pPr>
+        <w:pStyle w:val="BodyText"/>
+      </w:pPr>
+      <w:r>
+        <w:drawing>
+          <wp:inline>
+            <wp:extent cx="5334000" cy="3429000"/>
+            <wp:effectExtent b="0" l="0" r="0" t="0"/>
+            <wp:docPr descr="" title="" id="72" name="Picture"/>
+            <a:graphic>
+              <a:graphicData uri="http://schemas.openxmlformats.org/drawingml/2006/picture">
+                <pic:pic>
+                  <pic:nvPicPr>
+                    <pic:cNvPr descr="ewg31_le_docx_files/figure-docx/unnamed-chunk-10-1.png" id="73" name="Picture"/>
+                    <pic:cNvPicPr>
+                      <a:picLocks noChangeArrowheads="1" noChangeAspect="1"/>
+                    </pic:cNvPicPr>
+                  </pic:nvPicPr>
+                  <pic:blipFill>
+                    <a:blip r:embed="rId71"/>
+                    <a:stretch>
+                      <a:fillRect/>
+                    </a:stretch>
+                  </pic:blipFill>
+                  <pic:spPr bwMode="auto">
+                    <a:xfrm>
+                      <a:off x="0" y="0"/>
+                      <a:ext cx="5334000" cy="3429000"/>
+                    </a:xfrm>
+                    <a:prstGeom prst="rect">
+                      <a:avLst/>
+                    </a:prstGeom>
+                    <a:noFill/>
+                    <a:ln w="9525">
+                      <a:noFill/>
+                      <a:headEnd/>
+                      <a:tailEnd/>
+                    </a:ln>
+                  </pic:spPr>
+                </pic:pic>
+              </a:graphicData>
+            </a:graphic>
+          </wp:inline>
+        </w:drawing>
       </w:r>
     </w:p>
     <w:p>
@@ -5325,7 +5341,7 @@
               <a:graphicData uri="http://schemas.openxmlformats.org/drawingml/2006/picture">
                 <pic:pic>
                   <pic:nvPicPr>
-                    <pic:cNvPr descr="ewg31_le_docx_files/figure-docx/unnamed-chunk-9-1.png" id="76" name="Picture"/>
+                    <pic:cNvPr descr="ewg31_le_docx_files/figure-docx/unnamed-chunk-10-2.png" id="76" name="Picture"/>
                     <pic:cNvPicPr>
                       <a:picLocks noChangeArrowheads="1" noChangeAspect="1"/>
                     </pic:cNvPicPr>
@@ -5358,27 +5374,104 @@
         </w:drawing>
       </w:r>
     </w:p>
-    <w:p>
-      <w:pPr>
-        <w:pStyle w:val="BodyText"/>
+    <w:bookmarkEnd w:id="77"/>
+    <w:bookmarkEnd w:id="78"/>
+    <w:bookmarkEnd w:id="79"/>
+    <w:bookmarkStart w:id="93" w:name="le-sector-trends"/>
+    <w:p>
+      <w:pPr>
+        <w:pStyle w:val="Heading2"/>
+      </w:pPr>
+      <w:r>
+        <w:t xml:space="preserve">1.8 Gulf-wide marine sector trends</w:t>
+      </w:r>
+    </w:p>
+    <w:p>
+      <w:pPr>
+        <w:pStyle w:val="FirstParagraph"/>
+      </w:pPr>
+      <w:r>
+        <w:t xml:space="preserve">These plots use the cleaned CE activity file from script 1, with the same coastal population adjustments applied in scripts 2 to 4.</w:t>
+      </w:r>
+      <w:r>
+        <w:t xml:space="preserve"> </w:t>
+      </w:r>
+      <w:r>
+        <w:rPr>
+          <w:bCs/>
+          <w:b/>
+        </w:rPr>
+        <w:t xml:space="preserve">Jobs</w:t>
+      </w:r>
+      <w:r>
+        <w:t xml:space="preserve"> </w:t>
+      </w:r>
+      <w:r>
+        <w:t xml:space="preserve">are coastal-adjusted totals (formal and informal) summed across all OHI regions.</w:t>
+      </w:r>
+      <w:r>
+        <w:t xml:space="preserve"> </w:t>
+      </w:r>
+      <w:r>
+        <w:rPr>
+          <w:bCs/>
+          <w:b/>
+        </w:rPr>
+        <w:t xml:space="preserve">Job quality</w:t>
+      </w:r>
+      <w:r>
+        <w:t xml:space="preserve"> </w:t>
+      </w:r>
+      <w:r>
+        <w:t xml:space="preserve">is pesos of social benefits per job in constant 2023 MXN.</w:t>
+      </w:r>
+      <w:r>
+        <w:t xml:space="preserve"> </w:t>
+      </w:r>
+      <w:r>
+        <w:rPr>
+          <w:bCs/>
+          <w:b/>
+        </w:rPr>
+        <w:t xml:space="preserve">Revenue</w:t>
+      </w:r>
+      <w:r>
+        <w:t xml:space="preserve"> </w:t>
+      </w:r>
+      <w:r>
+        <w:t xml:space="preserve">is coastal-adjusted operating revenue in constant 2023 MXN. Lines are colored by marine sector.</w:t>
+      </w:r>
+    </w:p>
+    <w:bookmarkStart w:id="92" w:name="sector-color-key"/>
+    <w:p>
+      <w:pPr>
+        <w:pStyle w:val="Heading3"/>
+      </w:pPr>
+      <w:r>
+        <w:t xml:space="preserve">1.8.1 Sector color key</w:t>
+      </w:r>
+    </w:p>
+    <w:p>
+      <w:pPr>
+        <w:pStyle w:val="FirstParagraph"/>
       </w:pPr>
       <w:r>
         <w:drawing>
           <wp:inline>
-            <wp:extent cx="5334000" cy="3429000"/>
+            <wp:extent cx="5334000" cy="1524000"/>
             <wp:effectExtent b="0" l="0" r="0" t="0"/>
-            <wp:docPr descr="" title="" id="78" name="Picture"/>
+            <wp:docPr descr="" title="" id="81" name="Picture"/>
             <a:graphic>
               <a:graphicData uri="http://schemas.openxmlformats.org/drawingml/2006/picture">
                 <pic:pic>
                   <pic:nvPicPr>
-                    <pic:cNvPr descr="ewg31_le_docx_files/figure-docx/unnamed-chunk-10-1.png" id="79" name="Picture"/>
+                    <pic:cNvPr descr="ewg31_le_docx_files/figure-docx/unnamed-chunk-12-1.png" id="82" name="Picture"/>
                     <pic:cNvPicPr>
                       <a:picLocks noChangeArrowheads="1" noChangeAspect="1"/>
                     </pic:cNvPicPr>
                   </pic:nvPicPr>
                   <pic:blipFill>
-                    <a:blip r:embed="rId77"/>
+                    <a:blip r:embed="rId80"/>
                     <a:stretch>
                       <a:fillRect/>
                     </a:stretch>
@@ -5386,7 +5479,7 @@
                   <pic:spPr bwMode="auto">
                     <a:xfrm>
                       <a:off x="0" y="0"/>
-                      <a:ext cx="5334000" cy="3429000"/>
+                      <a:ext cx="5334000" cy="1524000"/>
                     </a:xfrm>
                     <a:prstGeom prst="rect">
                       <a:avLst/>
@@ -5410,22 +5503,30 @@
         <w:pStyle w:val="BodyText"/>
       </w:pPr>
       <w:r>
+        <w:t xml:space="preserve">Three separate figures: total jobs, job quality (social benefits per job), and total revenue, each summed across all OHI regions. Use the sector color key above (or the legend beside each plot) to read the lines.</w:t>
+      </w:r>
+    </w:p>
+    <w:p>
+      <w:pPr>
+        <w:pStyle w:val="BodyText"/>
+      </w:pPr>
+      <w:r>
         <w:drawing>
           <wp:inline>
-            <wp:extent cx="5334000" cy="3429000"/>
+            <wp:extent cx="5334000" cy="3810000"/>
             <wp:effectExtent b="0" l="0" r="0" t="0"/>
-            <wp:docPr descr="" title="" id="81" name="Picture"/>
+            <wp:docPr descr="" title="" id="84" name="Picture"/>
             <a:graphic>
               <a:graphicData uri="http://schemas.openxmlformats.org/drawingml/2006/picture">
                 <pic:pic>
                   <pic:nvPicPr>
-                    <pic:cNvPr descr="ewg31_le_docx_files/figure-docx/unnamed-chunk-10-2.png" id="82" name="Picture"/>
+                    <pic:cNvPr descr="ewg31_le_docx_files/figure-docx/unnamed-chunk-13-1.png" id="85" name="Picture"/>
                     <pic:cNvPicPr>
                       <a:picLocks noChangeArrowheads="1" noChangeAspect="1"/>
                     </pic:cNvPicPr>
                   </pic:nvPicPr>
                   <pic:blipFill>
-                    <a:blip r:embed="rId80"/>
+                    <a:blip r:embed="rId83"/>
                     <a:stretch>
                       <a:fillRect/>
                     </a:stretch>
@@ -5433,7 +5534,7 @@
                   <pic:spPr bwMode="auto">
                     <a:xfrm>
                       <a:off x="0" y="0"/>
-                      <a:ext cx="5334000" cy="3429000"/>
+                      <a:ext cx="5334000" cy="3810000"/>
                     </a:xfrm>
                     <a:prstGeom prst="rect">
                       <a:avLst/>
@@ -5452,98 +5553,21 @@
         </w:drawing>
       </w:r>
     </w:p>
-    <w:bookmarkEnd w:id="83"/>
-    <w:bookmarkEnd w:id="84"/>
-    <w:bookmarkEnd w:id="85"/>
-    <w:bookmarkStart w:id="93" w:name="le-sector-trends"/>
-    <w:p>
-      <w:pPr>
-        <w:pStyle w:val="Heading2"/>
-      </w:pPr>
-      <w:r>
-        <w:t xml:space="preserve">1.8 Gulf-wide marine sector trends</w:t>
-      </w:r>
-    </w:p>
-    <w:p>
-      <w:pPr>
-        <w:pStyle w:val="FirstParagraph"/>
-      </w:pPr>
-      <w:r>
-        <w:t xml:space="preserve">These plots use the cleaned CE activity file from script 1, with the same coastal population adjustments applied in scripts 2 to 4.</w:t>
-      </w:r>
-      <w:r>
-        <w:t xml:space="preserve"> </w:t>
-      </w:r>
-      <w:r>
-        <w:rPr>
-          <w:bCs/>
-          <w:b/>
-        </w:rPr>
-        <w:t xml:space="preserve">Jobs</w:t>
-      </w:r>
-      <w:r>
-        <w:t xml:space="preserve"> </w:t>
-      </w:r>
-      <w:r>
-        <w:t xml:space="preserve">are coastal-adjusted H000A totals summed across all OHI regions.</w:t>
-      </w:r>
-      <w:r>
-        <w:t xml:space="preserve"> </w:t>
-      </w:r>
-      <w:r>
-        <w:rPr>
-          <w:bCs/>
-          <w:b/>
-        </w:rPr>
-        <w:t xml:space="preserve">Job quality</w:t>
-      </w:r>
-      <w:r>
-        <w:t xml:space="preserve"> </w:t>
-      </w:r>
-      <w:r>
-        <w:t xml:space="preserve">is (J300A + J400A) in constant 2023 MXN per job.</w:t>
-      </w:r>
-      <w:r>
-        <w:t xml:space="preserve"> </w:t>
-      </w:r>
-      <w:r>
-        <w:rPr>
-          <w:bCs/>
-          <w:b/>
-        </w:rPr>
-        <w:t xml:space="preserve">Revenue</w:t>
-      </w:r>
-      <w:r>
-        <w:t xml:space="preserve"> </w:t>
-      </w:r>
-      <w:r>
-        <w:t xml:space="preserve">is coastal-adjusted M000A in constant 2023 MXN. Lines are colored by marine sector.</w:t>
-      </w:r>
-    </w:p>
-    <w:bookmarkStart w:id="92" w:name="sector-color-key"/>
-    <w:p>
-      <w:pPr>
-        <w:pStyle w:val="Heading3"/>
-      </w:pPr>
-      <w:r>
-        <w:t xml:space="preserve">1.8.1 Sector color key</w:t>
-      </w:r>
-    </w:p>
-    <w:p>
-      <w:pPr>
-        <w:pStyle w:val="FirstParagraph"/>
+    <w:p>
+      <w:pPr>
+        <w:pStyle w:val="BodyText"/>
       </w:pPr>
       <w:r>
         <w:drawing>
           <wp:inline>
-            <wp:extent cx="5334000" cy="762000"/>
+            <wp:extent cx="5334000" cy="3810000"/>
             <wp:effectExtent b="0" l="0" r="0" t="0"/>
             <wp:docPr descr="" title="" id="87" name="Picture"/>
             <a:graphic>
               <a:graphicData uri="http://schemas.openxmlformats.org/drawingml/2006/picture">
                 <pic:pic>
                   <pic:nvPicPr>
-                    <pic:cNvPr descr="ewg31_le_docx_files/figure-docx/unnamed-chunk-12-1.png" id="88" name="Picture"/>
+                    <pic:cNvPr descr="ewg31_le_docx_files/figure-docx/unnamed-chunk-13-2.png" id="88" name="Picture"/>
                     <pic:cNvPicPr>
                       <a:picLocks noChangeArrowheads="1" noChangeAspect="1"/>
                     </pic:cNvPicPr>
@@ -5557,7 +5581,7 @@
                   <pic:spPr bwMode="auto">
                     <a:xfrm>
                       <a:off x="0" y="0"/>
-                      <a:ext cx="5334000" cy="762000"/>
+                      <a:ext cx="5334000" cy="3810000"/>
                     </a:xfrm>
                     <a:prstGeom prst="rect">
                       <a:avLst/>
@@ -5581,24 +5605,16 @@
         <w:pStyle w:val="BodyText"/>
       </w:pPr>
       <w:r>
-        <w:t xml:space="preserve">One figure with three panels: total jobs, benefits per job, and total revenue, each summed across all OHI regions. Use the sector color key above to read the lines in each panel.</w:t>
-      </w:r>
-    </w:p>
-    <w:p>
-      <w:pPr>
-        <w:pStyle w:val="BodyText"/>
-      </w:pPr>
-      <w:r>
         <w:drawing>
           <wp:inline>
-            <wp:extent cx="5334000" cy="7620000"/>
+            <wp:extent cx="5334000" cy="3810000"/>
             <wp:effectExtent b="0" l="0" r="0" t="0"/>
             <wp:docPr descr="" title="" id="90" name="Picture"/>
             <a:graphic>
               <a:graphicData uri="http://schemas.openxmlformats.org/drawingml/2006/picture">
                 <pic:pic>
                   <pic:nvPicPr>
-                    <pic:cNvPr descr="ewg31_le_docx_files/figure-docx/unnamed-chunk-13-1.png" id="91" name="Picture"/>
+                    <pic:cNvPr descr="ewg31_le_docx_files/figure-docx/unnamed-chunk-13-3.png" id="91" name="Picture"/>
                     <pic:cNvPicPr>
                       <a:picLocks noChangeArrowheads="1" noChangeAspect="1"/>
                     </pic:cNvPicPr>
@@ -5612,7 +5628,7 @@
                   <pic:spPr bwMode="auto">
                     <a:xfrm>
                       <a:off x="0" y="0"/>
-                      <a:ext cx="5334000" cy="7620000"/>
+                      <a:ext cx="5334000" cy="3810000"/>
                     </a:xfrm>
                     <a:prstGeom prst="rect">
                       <a:avLst/>

</xml_diff>